<commit_message>
Cadastro aceita somente e-mails da UNIPAR (RN23)
Nova regra de validação App\Rules\UniparEmail: o domínio do e-mail precisa
ter "unipar" como uma de suas partes (nome@unipar.br, nome@edu.unipar.br).
Vale no cadastro e ao trocar o e-mail no perfil; contas já existentes com
outro e-mail continuam funcionando.

Testes passam a usar e-mails @unipar.br, com 10 testes novos para a regra
(173 no total). O documento de requisitos ganhou a RN23, citada no RF01,
no UC01 (exceção E2) e no UC05, e o README explica a regra.

Co-Authored-By: Claude Opus 5.5 <noreply@anthropic.com>
</commit_message>
<xml_diff>
--- a/docs/UNIPAR-ENCONTRA-Analise-de-Requisitos-e-Projeto.docx
+++ b/docs/UNIPAR-ENCONTRA-Analise-de-Requisitos-e-Projeto.docx
@@ -4600,7 +4600,7 @@
                 <w:sz w:val="20"/>
                 <w:szCs w:val="20"/>
               </w:rPr>
-              <w:t xml:space="preserve">O visitante cria uma conta informando nome, e-mail e senha (com confirmação) e, opcionalmente, RA e curso. Após o cadastro, ele já entra no sistema.</w:t>
+              <w:t xml:space="preserve">O visitante cria uma conta informando nome, e-mail da UNIPAR e senha (com confirmação) e, opcionalmente, RA e curso. Após o cadastro, ele já entra no sistema.</w:t>
             </w:r>
           </w:p>
         </w:tc>
@@ -10878,6 +10878,63 @@
                 <w:szCs w:val="20"/>
               </w:rPr>
               <w:t xml:space="preserve">Os relatórios de objetos perdidos e encontrados não incluem publicações rejeitadas. O filtro de período considera a data da ocorrência (perdidos e encontrados), a data da entrega (devolvidos) ou a data da solicitação (solicitações).</w:t>
+            </w:r>
+          </w:p>
+        </w:tc>
+      </w:tr>
+      <w:tr>
+        <w:trPr>
+          <w:cantSplit/>
+        </w:trPr>
+        <w:tc>
+          <w:tcPr>
+            <w:tcW w:type="dxa" w:w="770"/>
+            <w:tcMar>
+              <w:top w:type="dxa" w:w="60"/>
+              <w:left w:type="dxa" w:w="100"/>
+              <w:bottom w:type="dxa" w:w="60"/>
+              <w:right w:type="dxa" w:w="100"/>
+            </w:tcMar>
+            <w:vAlign w:val="top"/>
+          </w:tcPr>
+          <w:p>
+            <w:pPr>
+              <w:keepLines/>
+              <w:spacing w:after="0" w:line="240"/>
+              <w:jc w:val="left"/>
+            </w:pPr>
+            <w:r>
+              <w:rPr>
+                <w:sz w:val="20"/>
+                <w:szCs w:val="20"/>
+              </w:rPr>
+              <w:t xml:space="preserve">RN23</w:t>
+            </w:r>
+          </w:p>
+        </w:tc>
+        <w:tc>
+          <w:tcPr>
+            <w:tcW w:type="dxa" w:w="8300"/>
+            <w:tcMar>
+              <w:top w:type="dxa" w:w="60"/>
+              <w:left w:type="dxa" w:w="100"/>
+              <w:bottom w:type="dxa" w:w="60"/>
+              <w:right w:type="dxa" w:w="100"/>
+            </w:tcMar>
+            <w:vAlign w:val="top"/>
+          </w:tcPr>
+          <w:p>
+            <w:pPr>
+              <w:keepLines/>
+              <w:spacing w:after="0" w:line="240"/>
+              <w:jc w:val="left"/>
+            </w:pPr>
+            <w:r>
+              <w:rPr>
+                <w:sz w:val="20"/>
+                <w:szCs w:val="20"/>
+              </w:rPr>
+              <w:t xml:space="preserve">O cadastro só aceita e-mails da UNIPAR: uma das partes do domínio (depois do @, separadas por ponto) deve ser "unipar", como em nome@unipar.br ou nome@edu.unipar.br; endereços como nome@gmail.com ou nome@naounipar.com são recusados. A regra também vale quando o usuário troca o e-mail no perfil.</w:t>
             </w:r>
           </w:p>
         </w:tc>
@@ -14375,7 +14432,7 @@
                 <w:sz w:val="20"/>
                 <w:szCs w:val="20"/>
               </w:rPr>
-              <w:t xml:space="preserve">RF01 · RN21</w:t>
+              <w:t xml:space="preserve">RF01 · RN21, RN23</w:t>
             </w:r>
           </w:p>
         </w:tc>
@@ -14514,7 +14571,7 @@
                 <w:sz w:val="20"/>
                 <w:szCs w:val="20"/>
               </w:rPr>
-              <w:t xml:space="preserve">2. O sistema exibe o formulário: nome, e-mail, RA (opcional), curso (opcional), senha e confirmação da senha.</w:t>
+              <w:t xml:space="preserve">2. O sistema exibe o formulário: nome, e-mail da UNIPAR, RA (opcional), curso (opcional), senha e confirmação da senha.</w:t>
             </w:r>
           </w:p>
           <w:p>
@@ -14660,7 +14717,7 @@
             <w:pPr>
               <w:keepNext/>
               <w:keepLines/>
-              <w:spacing w:after="0" w:line="240"/>
+              <w:spacing w:after="60" w:line="240"/>
               <w:jc w:val="left"/>
             </w:pPr>
             <w:r>
@@ -14669,6 +14726,21 @@
                 <w:szCs w:val="20"/>
               </w:rPr>
               <w:t xml:space="preserve">E1. Dados inválidos (e-mail ou RA já cadastrado, senha com menos de 8 caracteres ou confirmação diferente): o sistema indica o erro no campo e mantém os dados digitados.</w:t>
+            </w:r>
+          </w:p>
+          <w:p>
+            <w:pPr>
+              <w:keepNext/>
+              <w:keepLines/>
+              <w:spacing w:after="0" w:line="240"/>
+              <w:jc w:val="left"/>
+            </w:pPr>
+            <w:r>
+              <w:rPr>
+                <w:sz w:val="20"/>
+                <w:szCs w:val="20"/>
+              </w:rPr>
+              <w:t xml:space="preserve">E2. E-mail que não é da UNIPAR (RN23): o sistema indica o erro no campo, orienta a usar o e-mail da UNIPAR (como nome@unipar.br) e mantém os dados digitados.</w:t>
             </w:r>
           </w:p>
         </w:tc>
@@ -16820,7 +16892,7 @@
                 <w:sz w:val="20"/>
                 <w:szCs w:val="20"/>
               </w:rPr>
-              <w:t xml:space="preserve">RF05 · RN20, RN21</w:t>
+              <w:t xml:space="preserve">RF05 · RN20, RN21, RN23</w:t>
             </w:r>
           </w:p>
         </w:tc>
@@ -17143,7 +17215,7 @@
                 <w:sz w:val="20"/>
                 <w:szCs w:val="20"/>
               </w:rPr>
-              <w:t xml:space="preserve">E1. E-mail ou RA já usado por outra conta: o sistema indica o erro.</w:t>
+              <w:t xml:space="preserve">E1. E-mail ou RA já usado por outra conta, ou novo e-mail que não é da UNIPAR (RN23): o sistema indica o erro.</w:t>
             </w:r>
           </w:p>
           <w:p>

</xml_diff>